<commit_message>
V1.0 for KTSP and other Models on TAN data set
</commit_message>
<xml_diff>
--- a/output/KTSP_train.docx
+++ b/output/KTSP_train.docx
@@ -41,16 +41,7 @@
           <w:rFonts w:hint="eastAsia"/>
           <w:lang w:val="en-US" w:eastAsia="zh-CN"/>
         </w:rPr>
-        <w:t>ForColon</w:t>
-      </w:r>
-      <w:bookmarkStart w:id="0" w:name="_GoBack"/>
-      <w:bookmarkEnd w:id="0"/>
-      <w:r>
-        <w:rPr>
-          <w:rFonts w:hint="eastAsia"/>
-          <w:lang w:val="en-US" w:eastAsia="zh-CN"/>
-        </w:rPr>
-        <w:t xml:space="preserve"> data</w:t>
+        <w:t>ForColon data</w:t>
       </w:r>
     </w:p>
     <w:p>
@@ -671,8 +662,6 @@
           </wp:inline>
         </w:drawing>
       </w:r>
-    </w:p>
-    <w:p>
       <w:r>
         <w:drawing>
           <wp:inline distT="0" distB="0" distL="114300" distR="114300">
@@ -717,6 +706,7 @@
         </w:drawing>
       </w:r>
     </w:p>
+    <w:p/>
     <w:p>
       <w:r>
         <w:drawing>
@@ -1054,6 +1044,7 @@
     <w:p>
       <w:pPr>
         <w:numPr>
+          <w:ilvl w:val="0"/>
           <w:numId w:val="0"/>
         </w:numPr>
         <w:rPr>
@@ -1072,6 +1063,7 @@
     <w:p>
       <w:pPr>
         <w:numPr>
+          <w:ilvl w:val="0"/>
           <w:numId w:val="0"/>
         </w:numPr>
       </w:pPr>
@@ -1122,6 +1114,7 @@
     <w:p>
       <w:pPr>
         <w:numPr>
+          <w:ilvl w:val="0"/>
           <w:numId w:val="0"/>
         </w:numPr>
       </w:pPr>
@@ -1129,6 +1122,7 @@
     <w:p>
       <w:pPr>
         <w:numPr>
+          <w:ilvl w:val="0"/>
           <w:numId w:val="0"/>
         </w:numPr>
       </w:pPr>
@@ -1179,6 +1173,7 @@
     <w:p>
       <w:pPr>
         <w:numPr>
+          <w:ilvl w:val="0"/>
           <w:numId w:val="0"/>
         </w:numPr>
       </w:pPr>
@@ -1229,6 +1224,7 @@
     <w:p>
       <w:pPr>
         <w:numPr>
+          <w:ilvl w:val="0"/>
           <w:numId w:val="0"/>
         </w:numPr>
         <w:rPr>
@@ -1283,6 +1279,7 @@
     <w:p>
       <w:pPr>
         <w:numPr>
+          <w:ilvl w:val="0"/>
           <w:numId w:val="0"/>
         </w:numPr>
       </w:pPr>
@@ -1310,6 +1307,7 @@
     <w:p>
       <w:pPr>
         <w:numPr>
+          <w:ilvl w:val="0"/>
           <w:numId w:val="0"/>
         </w:numPr>
         <w:ind w:leftChars="0"/>
@@ -1361,6 +1359,7 @@
     <w:p>
       <w:pPr>
         <w:numPr>
+          <w:ilvl w:val="0"/>
           <w:numId w:val="0"/>
         </w:numPr>
         <w:ind w:leftChars="0"/>
@@ -1369,6 +1368,7 @@
     <w:p>
       <w:pPr>
         <w:numPr>
+          <w:ilvl w:val="0"/>
           <w:numId w:val="0"/>
         </w:numPr>
         <w:ind w:leftChars="0"/>
@@ -1416,10 +1416,13 @@
           </wp:inline>
         </w:drawing>
       </w:r>
+      <w:bookmarkStart w:id="0" w:name="_GoBack"/>
+      <w:bookmarkEnd w:id="0"/>
     </w:p>
     <w:p>
       <w:pPr>
         <w:numPr>
+          <w:ilvl w:val="0"/>
           <w:numId w:val="0"/>
         </w:numPr>
         <w:ind w:leftChars="0"/>
@@ -1471,6 +1474,7 @@
     <w:p>
       <w:pPr>
         <w:numPr>
+          <w:ilvl w:val="0"/>
           <w:numId w:val="0"/>
         </w:numPr>
         <w:ind w:leftChars="0"/>
@@ -1554,6 +1558,7 @@
     <w:p>
       <w:pPr>
         <w:numPr>
+          <w:ilvl w:val="0"/>
           <w:numId w:val="0"/>
         </w:numPr>
         <w:ind w:leftChars="0"/>
@@ -1605,6 +1610,7 @@
     <w:p>
       <w:pPr>
         <w:numPr>
+          <w:ilvl w:val="0"/>
           <w:numId w:val="0"/>
         </w:numPr>
         <w:ind w:leftChars="0"/>
@@ -1656,6 +1662,7 @@
     <w:p>
       <w:pPr>
         <w:numPr>
+          <w:ilvl w:val="0"/>
           <w:numId w:val="0"/>
         </w:numPr>
         <w:ind w:leftChars="0"/>
@@ -1707,6 +1714,7 @@
     <w:p>
       <w:pPr>
         <w:numPr>
+          <w:ilvl w:val="0"/>
           <w:numId w:val="0"/>
         </w:numPr>
         <w:ind w:leftChars="0"/>

</xml_diff>